<commit_message>
Declare Calibri as the default font in the blank templates and fix their zip packaging, bump to 0.17.10-alpha (#32)
</commit_message>
<xml_diff>
--- a/src-tauri/templates/blank.docx
+++ b/src-tauri/templates/blank.docx
@@ -1,9 +1,24 @@
 
-<file path=word\document.xml><?xml version="1.0" encoding="utf-8"?>
+<file path=word/document.xml><?xml version="1.0" encoding="utf-8"?>
 <w:document xmlns:w="http://schemas.openxmlformats.org/wordprocessingml/2006/main">
   <w:body>
     <w:p/>
     <w:sectPr/>
   </w:body>
 </w:document>
+</file>
+
+<file path=word/styles.xml><?xml version="1.0" encoding="utf-8"?>
+<w:styles xmlns:w="http://schemas.openxmlformats.org/wordprocessingml/2006/main">
+  <w:docDefaults>
+    <w:rPrDefault>
+      <w:rPr>
+        <w:rFonts w:ascii="Calibri" w:hAnsi="Calibri" w:eastAsia="Calibri" w:cs="Calibri"/>
+        <w:sz w:val="22"/>
+        <w:szCs w:val="22"/>
+      </w:rPr>
+    </w:rPrDefault>
+    <w:pPrDefault/>
+  </w:docDefaults>
+</w:styles>
 </file>
</xml_diff>